<commit_message>
Multiple Cox Proportional Regression Table finish
</commit_message>
<xml_diff>
--- a/Biostats 2/Homework/Proportional Hazards Regression Model/Exports/Table_1.docx
+++ b/Biostats 2/Homework/Proportional Hazards Regression Model/Exports/Table_1.docx
@@ -8,24 +8,6 @@
       </w:pPr>
       <w:r>
         <w:t xml:space="preserve"/>
-      </w:r>
-    </w:p>
-    <w:p>
-      <w:pPr>
-        <w:pStyle w:val="TableCaption"/>
-        <w:jc w:val="center"/>
-        <w:keepNext/>
-        <w:pBdr>
-          <w:bottom w:val="none" w:sz="0" w:space="0" w:color="000000"/>
-          <w:top w:val="none" w:sz="0" w:space="0" w:color="000000"/>
-          <w:left w:val="none" w:sz="0" w:space="0" w:color="000000"/>
-          <w:right w:val="none" w:sz="0" w:space="0" w:color="000000"/>
-        </w:pBdr>
-        <w:spacing w:after="60" w:before="60" w:line="240"/>
-        <w:ind w:left="60" w:right="60" w:firstLine="0" w:firstLineChars="0"/>
-      </w:pPr>
-      <w:r>
-        <w:t xml:space="preserve">**Table 1: Study Population**</w:t>
       </w:r>
     </w:p>
     <w:tbl xmlns:a="http://schemas.openxmlformats.org/drawingml/2006/main" xmlns:pic="http://schemas.openxmlformats.org/drawingml/2006/picture">

</xml_diff>